<commit_message>
Generate Q1 Reports without targets
</commit_message>
<xml_diff>
--- a/sales_analysis_q1.docx
+++ b/sales_analysis_q1.docx
@@ -270,7 +270,7 @@
         <w:rPr>
           <w:sz w:val="20"/>
         </w:rPr>
-        <w:t>After Week 1, the branch has achieved 101.9% of the monthly target (KES 180M). This puts us AHEAD of the expected 25% pace.</w:t>
+        <w:t>After Week 1, the branch has achieved 305.7% of the monthly target (KES 60M). This puts us AHEAD of the expected 25% pace.</w:t>
       </w:r>
     </w:p>
     <w:tbl>
@@ -391,7 +391,7 @@
               <w:rPr>
                 <w:sz w:val="18"/>
               </w:rPr>
-              <w:t>KES 145,500,000</w:t>
+              <w:t>KES 48,500,000</w:t>
             </w:r>
           </w:p>
         </w:tc>
@@ -417,7 +417,7 @@
               <w:rPr>
                 <w:sz w:val="18"/>
               </w:rPr>
-              <w:t>109.9%</w:t>
+              <w:t>329.8%</w:t>
             </w:r>
           </w:p>
         </w:tc>
@@ -458,7 +458,7 @@
               <w:rPr>
                 <w:sz w:val="18"/>
               </w:rPr>
-              <w:t>KES 21,000,000</w:t>
+              <w:t>KES 7,000,000</w:t>
             </w:r>
           </w:p>
         </w:tc>
@@ -484,7 +484,7 @@
               <w:rPr>
                 <w:sz w:val="18"/>
               </w:rPr>
-              <w:t>75.1%</w:t>
+              <w:t>225.3%</w:t>
             </w:r>
           </w:p>
         </w:tc>
@@ -525,7 +525,7 @@
               <w:rPr>
                 <w:sz w:val="18"/>
               </w:rPr>
-              <w:t>KES 9,000,000</w:t>
+              <w:t>KES 3,000,000</w:t>
             </w:r>
           </w:p>
         </w:tc>
@@ -551,7 +551,7 @@
               <w:rPr>
                 <w:sz w:val="18"/>
               </w:rPr>
-              <w:t>62.6%</w:t>
+              <w:t>187.9%</w:t>
             </w:r>
           </w:p>
         </w:tc>
@@ -592,7 +592,7 @@
               <w:rPr>
                 <w:sz w:val="18"/>
               </w:rPr>
-              <w:t>KES 4,500,000</w:t>
+              <w:t>KES 1,500,000</w:t>
             </w:r>
           </w:p>
         </w:tc>
@@ -618,7 +618,7 @@
               <w:rPr>
                 <w:sz w:val="18"/>
               </w:rPr>
-              <w:t>46.7%</w:t>
+              <w:t>140.2%</w:t>
             </w:r>
           </w:p>
         </w:tc>
@@ -665,7 +665,7 @@
                 <w:color w:val="FFFFFF"/>
                 <w:sz w:val="18"/>
               </w:rPr>
-              <w:t>KES 180,000,000</w:t>
+              <w:t>KES 60,000,000</w:t>
             </w:r>
           </w:p>
         </w:tc>
@@ -697,7 +697,7 @@
                 <w:color w:val="FFFFFF"/>
                 <w:sz w:val="18"/>
               </w:rPr>
-              <w:t>101.9%</w:t>
+              <w:t>305.7%</w:t>
             </w:r>
           </w:p>
         </w:tc>

</xml_diff>

<commit_message>
Customer sales report and market analysis updatesS
</commit_message>
<xml_diff>
--- a/sales_analysis_q1.docx
+++ b/sales_analysis_q1.docx
@@ -98,7 +98,7 @@
               <w:rPr>
                 <w:sz w:val="20"/>
               </w:rPr>
-              <w:t>KES 183,444,382</w:t>
+              <w:t>KES 183,447,102</w:t>
             </w:r>
           </w:p>
         </w:tc>
@@ -128,7 +128,7 @@
               <w:rPr>
                 <w:sz w:val="20"/>
               </w:rPr>
-              <w:t>KES 16,495,301</w:t>
+              <w:t>KES 16,495,840</w:t>
             </w:r>
           </w:p>
         </w:tc>
@@ -188,7 +188,7 @@
               <w:rPr>
                 <w:sz w:val="20"/>
               </w:rPr>
-              <w:t>KES 2,478,978</w:t>
+              <w:t>KES 2,479,015</w:t>
             </w:r>
           </w:p>
         </w:tc>
@@ -218,7 +218,7 @@
               <w:rPr>
                 <w:sz w:val="20"/>
               </w:rPr>
-              <w:t>KES 222,909</w:t>
+              <w:t>KES 222,917</w:t>
             </w:r>
           </w:p>
         </w:tc>
@@ -248,7 +248,7 @@
               <w:rPr>
                 <w:sz w:val="20"/>
               </w:rPr>
-              <w:t>10</w:t>
+              <w:t>9</w:t>
             </w:r>
           </w:p>
         </w:tc>
@@ -404,7 +404,7 @@
               <w:rPr>
                 <w:sz w:val="18"/>
               </w:rPr>
-              <w:t>KES 159,936,565</w:t>
+              <w:t>KES 159,937,385</w:t>
             </w:r>
           </w:p>
         </w:tc>
@@ -471,7 +471,7 @@
               <w:rPr>
                 <w:sz w:val="18"/>
               </w:rPr>
-              <w:t>KES 15,769,084</w:t>
+              <w:t>KES 15,770,984</w:t>
             </w:r>
           </w:p>
         </w:tc>
@@ -681,7 +681,7 @@
                 <w:color w:val="FFFFFF"/>
                 <w:sz w:val="18"/>
               </w:rPr>
-              <w:t>KES 183,444,382</w:t>
+              <w:t>KES 183,447,102</w:t>
             </w:r>
           </w:p>
         </w:tc>
@@ -1586,92 +1586,6 @@
                 <w:sz w:val="18"/>
               </w:rPr>
               <w:t>0.0%</w:t>
-            </w:r>
-          </w:p>
-        </w:tc>
-      </w:tr>
-      <w:tr>
-        <w:tc>
-          <w:tcPr>
-            <w:tcW w:type="dxa" w:w="1656"/>
-            <w:shd w:fill="ECF0F1"/>
-          </w:tcPr>
-          <w:p>
-            <w:r>
-              <w:rPr>
-                <w:sz w:val="18"/>
-              </w:rPr>
-              <w:t>10</w:t>
-            </w:r>
-          </w:p>
-        </w:tc>
-        <w:tc>
-          <w:tcPr>
-            <w:tcW w:type="dxa" w:w="1656"/>
-            <w:shd w:fill="ECF0F1"/>
-          </w:tcPr>
-          <w:p>
-            <w:r>
-              <w:rPr>
-                <w:sz w:val="18"/>
-              </w:rPr>
-              <w:t>Unknown</w:t>
-            </w:r>
-          </w:p>
-        </w:tc>
-        <w:tc>
-          <w:tcPr>
-            <w:tcW w:type="dxa" w:w="1656"/>
-            <w:shd w:fill="ECF0F1"/>
-          </w:tcPr>
-          <w:p>
-            <w:r>
-              <w:rPr>
-                <w:sz w:val="18"/>
-              </w:rPr>
-              <w:t>-2,720</w:t>
-            </w:r>
-          </w:p>
-        </w:tc>
-        <w:tc>
-          <w:tcPr>
-            <w:tcW w:type="dxa" w:w="1656"/>
-            <w:shd w:fill="ECF0F1"/>
-          </w:tcPr>
-          <w:p>
-            <w:r>
-              <w:rPr>
-                <w:sz w:val="18"/>
-              </w:rPr>
-              <w:t>-540</w:t>
-            </w:r>
-          </w:p>
-        </w:tc>
-        <w:tc>
-          <w:tcPr>
-            <w:tcW w:type="dxa" w:w="1656"/>
-            <w:shd w:fill="ECF0F1"/>
-          </w:tcPr>
-          <w:p>
-            <w:r>
-              <w:rPr>
-                <w:sz w:val="18"/>
-              </w:rPr>
-              <w:t>0.0%</w:t>
-            </w:r>
-          </w:p>
-        </w:tc>
-        <w:tc>
-          <w:tcPr>
-            <w:tcW w:type="dxa" w:w="1656"/>
-            <w:shd w:fill="ECF0F1"/>
-          </w:tcPr>
-          <w:p>
-            <w:r>
-              <w:rPr>
-                <w:sz w:val="18"/>
-              </w:rPr>
-              <w:t>-0.0%</w:t>
             </w:r>
           </w:p>
         </w:tc>
@@ -1917,7 +1831,7 @@
         <w:rPr>
           <w:sz w:val="20"/>
         </w:rPr>
-        <w:t>Sales: KES 159,936,565  |  Profit: KES 11,856,014  |  Margin: 7.4%</w:t>
+        <w:t>Sales: KES 159,937,385  |  Profit: KES 11,856,258  |  Margin: 7.4%</w:t>
       </w:r>
     </w:p>
     <w:tbl>
@@ -2614,73 +2528,6 @@
                 <w:sz w:val="18"/>
               </w:rPr>
               <w:t>0.0%</w:t>
-            </w:r>
-          </w:p>
-        </w:tc>
-      </w:tr>
-      <w:tr>
-        <w:tc>
-          <w:tcPr>
-            <w:tcW w:type="dxa" w:w="1987"/>
-          </w:tcPr>
-          <w:p>
-            <w:r>
-              <w:rPr>
-                <w:sz w:val="18"/>
-              </w:rPr>
-              <w:t>Unknown</w:t>
-            </w:r>
-          </w:p>
-        </w:tc>
-        <w:tc>
-          <w:tcPr>
-            <w:tcW w:type="dxa" w:w="1987"/>
-          </w:tcPr>
-          <w:p>
-            <w:r>
-              <w:rPr>
-                <w:sz w:val="18"/>
-              </w:rPr>
-              <w:t>KES -820</w:t>
-            </w:r>
-          </w:p>
-        </w:tc>
-        <w:tc>
-          <w:tcPr>
-            <w:tcW w:type="dxa" w:w="1987"/>
-          </w:tcPr>
-          <w:p>
-            <w:r>
-              <w:rPr>
-                <w:sz w:val="18"/>
-              </w:rPr>
-              <w:t>KES -244</w:t>
-            </w:r>
-          </w:p>
-        </w:tc>
-        <w:tc>
-          <w:tcPr>
-            <w:tcW w:type="dxa" w:w="1987"/>
-          </w:tcPr>
-          <w:p>
-            <w:r>
-              <w:rPr>
-                <w:sz w:val="18"/>
-              </w:rPr>
-              <w:t>0.0%</w:t>
-            </w:r>
-          </w:p>
-        </w:tc>
-        <w:tc>
-          <w:tcPr>
-            <w:tcW w:type="dxa" w:w="1987"/>
-          </w:tcPr>
-          <w:p>
-            <w:r>
-              <w:rPr>
-                <w:sz w:val="18"/>
-              </w:rPr>
-              <w:t>-0.0%</w:t>
             </w:r>
           </w:p>
         </w:tc>
@@ -2711,7 +2558,7 @@
         <w:rPr>
           <w:sz w:val="20"/>
         </w:rPr>
-        <w:t>Sales: KES 15,769,084  |  Profit: KES 2,725,590  |  Margin: 17.3%</w:t>
+        <w:t>Sales: KES 15,770,984  |  Profit: KES 2,725,886  |  Margin: 17.3%</w:t>
       </w:r>
     </w:p>
     <w:tbl>
@@ -3408,73 +3255,6 @@
                 <w:sz w:val="18"/>
               </w:rPr>
               <w:t>0.1%</w:t>
-            </w:r>
-          </w:p>
-        </w:tc>
-      </w:tr>
-      <w:tr>
-        <w:tc>
-          <w:tcPr>
-            <w:tcW w:type="dxa" w:w="1987"/>
-          </w:tcPr>
-          <w:p>
-            <w:r>
-              <w:rPr>
-                <w:sz w:val="18"/>
-              </w:rPr>
-              <w:t>Unknown</w:t>
-            </w:r>
-          </w:p>
-        </w:tc>
-        <w:tc>
-          <w:tcPr>
-            <w:tcW w:type="dxa" w:w="1987"/>
-          </w:tcPr>
-          <w:p>
-            <w:r>
-              <w:rPr>
-                <w:sz w:val="18"/>
-              </w:rPr>
-              <w:t>KES -1,900</w:t>
-            </w:r>
-          </w:p>
-        </w:tc>
-        <w:tc>
-          <w:tcPr>
-            <w:tcW w:type="dxa" w:w="1987"/>
-          </w:tcPr>
-          <w:p>
-            <w:r>
-              <w:rPr>
-                <w:sz w:val="18"/>
-              </w:rPr>
-              <w:t>KES -296</w:t>
-            </w:r>
-          </w:p>
-        </w:tc>
-        <w:tc>
-          <w:tcPr>
-            <w:tcW w:type="dxa" w:w="1987"/>
-          </w:tcPr>
-          <w:p>
-            <w:r>
-              <w:rPr>
-                <w:sz w:val="18"/>
-              </w:rPr>
-              <w:t>0.0%</w:t>
-            </w:r>
-          </w:p>
-        </w:tc>
-        <w:tc>
-          <w:tcPr>
-            <w:tcW w:type="dxa" w:w="1987"/>
-          </w:tcPr>
-          <w:p>
-            <w:r>
-              <w:rPr>
-                <w:sz w:val="18"/>
-              </w:rPr>
-              <w:t>-0.0%</w:t>
             </w:r>
           </w:p>
         </w:tc>
@@ -5604,7 +5384,7 @@
           <w:color w:val="27AE60"/>
           <w:sz w:val="18"/>
         </w:rPr>
-        <w:t>Outstanding! Sales 304% above team average</w:t>
+        <w:t>Outstanding! Sales 264% above team average</w:t>
       </w:r>
     </w:p>
     <w:p>
@@ -5616,7 +5396,7 @@
           <w:color w:val="E74C3C"/>
           <w:sz w:val="18"/>
         </w:rPr>
-        <w:t>Margin at 6.1% below team average of 11.3%</w:t>
+        <w:t>Margin at 6.1% below team average of 12.5%</w:t>
       </w:r>
     </w:p>
     <w:p>
@@ -6300,7 +6080,7 @@
           <w:color w:val="27AE60"/>
           <w:sz w:val="18"/>
         </w:rPr>
-        <w:t>Outstanding! Sales 112% above team average</w:t>
+        <w:t>Outstanding! Sales 91% above team average</w:t>
       </w:r>
     </w:p>
     <w:p>
@@ -6312,7 +6092,7 @@
           <w:color w:val="E74C3C"/>
           <w:sz w:val="18"/>
         </w:rPr>
-        <w:t>Margin at 8.6% below team average of 11.3%</w:t>
+        <w:t>Margin at 8.6% below team average of 12.5%</w:t>
       </w:r>
     </w:p>
     <w:p>
@@ -6996,7 +6776,19 @@
           <w:color w:val="27AE60"/>
           <w:sz w:val="18"/>
         </w:rPr>
-        <w:t>Outstanding! Sales 68% above team average</w:t>
+        <w:t>Outstanding! Sales 51% above team average</w:t>
+      </w:r>
+    </w:p>
+    <w:p>
+      <w:pPr>
+        <w:pStyle w:val="ListBullet"/>
+      </w:pPr>
+      <w:r>
+        <w:rPr>
+          <w:color w:val="E74C3C"/>
+          <w:sz w:val="18"/>
+        </w:rPr>
+        <w:t>Margin at 9.4% below team average of 12.5%</w:t>
       </w:r>
     </w:p>
     <w:p>
@@ -7680,19 +7472,7 @@
           <w:color w:val="E74C3C"/>
           <w:sz w:val="18"/>
         </w:rPr>
-        <w:t>Sales 27% below team average - needs improvement</w:t>
-      </w:r>
-    </w:p>
-    <w:p>
-      <w:pPr>
-        <w:pStyle w:val="ListBullet"/>
-      </w:pPr>
-      <w:r>
-        <w:rPr>
-          <w:color w:val="27AE60"/>
-          <w:sz w:val="18"/>
-        </w:rPr>
-        <w:t>Excellent margin at 15.1% (Team avg: 11.3%)</w:t>
+        <w:t>Sales 35% below team average - needs improvement</w:t>
       </w:r>
     </w:p>
     <w:p>
@@ -7729,6 +7509,18 @@
           <w:sz w:val="18"/>
         </w:rPr>
         <w:t>Selling across all 4 categories - excellent product range</w:t>
+      </w:r>
+    </w:p>
+    <w:p>
+      <w:pPr>
+        <w:pStyle w:val="ListBullet"/>
+      </w:pPr>
+      <w:r>
+        <w:rPr>
+          <w:color w:val="555555"/>
+          <w:sz w:val="18"/>
+        </w:rPr>
+        <w:t>Best margin in ELECTRICALS: 35.5%</w:t>
       </w:r>
     </w:p>
     <w:p/>
@@ -8376,7 +8168,7 @@
           <w:color w:val="E74C3C"/>
           <w:sz w:val="18"/>
         </w:rPr>
-        <w:t>Sales 28% below team average - needs improvement</w:t>
+        <w:t>Sales 35% below team average - needs improvement</w:t>
       </w:r>
     </w:p>
     <w:p>
@@ -9070,7 +8862,7 @@
           <w:color w:val="E74C3C"/>
           <w:sz w:val="18"/>
         </w:rPr>
-        <w:t>Sales 66% below team average - needs improvement</w:t>
+        <w:t>Sales 69% below team average - needs improvement</w:t>
       </w:r>
     </w:p>
     <w:p>
@@ -9082,7 +8874,7 @@
           <w:color w:val="27AE60"/>
           <w:sz w:val="18"/>
         </w:rPr>
-        <w:t>Excellent margin at 18.2% (Team avg: 11.3%)</w:t>
+        <w:t>Excellent margin at 18.2% (Team avg: 12.5%)</w:t>
       </w:r>
     </w:p>
     <w:p>
@@ -9766,7 +9558,7 @@
           <w:color w:val="E74C3C"/>
           <w:sz w:val="18"/>
         </w:rPr>
-        <w:t>Sales 71% below team average - needs improvement</w:t>
+        <w:t>Sales 73% below team average - needs improvement</w:t>
       </w:r>
     </w:p>
     <w:p>
@@ -9778,7 +9570,7 @@
           <w:color w:val="27AE60"/>
           <w:sz w:val="18"/>
         </w:rPr>
-        <w:t>Excellent margin at 16.3% (Team avg: 11.3%)</w:t>
+        <w:t>Excellent margin at 16.3% (Team avg: 12.5%)</w:t>
       </w:r>
     </w:p>
     <w:p>
@@ -10462,7 +10254,7 @@
           <w:color w:val="E74C3C"/>
           <w:sz w:val="18"/>
         </w:rPr>
-        <w:t>Sales 93% below team average - needs improvement</w:t>
+        <w:t>Sales 94% below team average - needs improvement</w:t>
       </w:r>
     </w:p>
     <w:p>
@@ -10474,7 +10266,7 @@
           <w:color w:val="27AE60"/>
           <w:sz w:val="18"/>
         </w:rPr>
-        <w:t>Excellent margin at 17.5% (Team avg: 11.3%)</w:t>
+        <w:t>Excellent margin at 17.5% (Team avg: 12.5%)</w:t>
       </w:r>
     </w:p>
     <w:p>
@@ -11210,488 +11002,83 @@
       </w:r>
     </w:p>
     <w:p/>
-    <w:p/>
+    <w:p>
+      <w:r>
+        <w:br w:type="page"/>
+      </w:r>
+    </w:p>
     <w:p>
       <w:r>
         <w:rPr>
           <w:b/>
           <w:color w:val="2C3E50"/>
-          <w:sz w:val="24"/>
+          <w:sz w:val="28"/>
         </w:rPr>
-        <w:t>UNKNOWN - General Hardware Team</w:t>
+        <w:t>Q1 2026 STRATEGIC BUSINESS INSIGHTS</w:t>
       </w:r>
     </w:p>
-    <w:tbl>
-      <w:tblPr>
-        <w:tblStyle w:val="TableGrid"/>
-        <w:tblW w:type="auto" w:w="0"/>
-        <w:jc w:val="center"/>
-        <w:tblLook w:firstColumn="1" w:firstRow="1" w:lastColumn="0" w:lastRow="0" w:noHBand="0" w:noVBand="1" w:val="04A0"/>
-      </w:tblPr>
-      <w:tblGrid>
-        <w:gridCol w:w="1987"/>
-        <w:gridCol w:w="1987"/>
-        <w:gridCol w:w="1987"/>
-        <w:gridCol w:w="1987"/>
-        <w:gridCol w:w="1987"/>
-      </w:tblGrid>
-      <w:tr>
-        <w:tc>
-          <w:tcPr>
-            <w:tcW w:type="dxa" w:w="1987"/>
-            <w:shd w:fill="34495E"/>
-          </w:tcPr>
-          <w:p>
-            <w:r>
-              <w:rPr>
-                <w:b/>
-                <w:color w:val="FFFFFF"/>
-                <w:sz w:val="18"/>
-              </w:rPr>
-              <w:t>Total Sales</w:t>
-            </w:r>
-          </w:p>
-        </w:tc>
-        <w:tc>
-          <w:tcPr>
-            <w:tcW w:type="dxa" w:w="1987"/>
-            <w:shd w:fill="34495E"/>
-          </w:tcPr>
-          <w:p>
-            <w:r>
-              <w:rPr>
-                <w:b/>
-                <w:color w:val="FFFFFF"/>
-                <w:sz w:val="18"/>
-              </w:rPr>
-              <w:t>Total Profit</w:t>
-            </w:r>
-          </w:p>
-        </w:tc>
-        <w:tc>
-          <w:tcPr>
-            <w:tcW w:type="dxa" w:w="1987"/>
-            <w:shd w:fill="34495E"/>
-          </w:tcPr>
-          <w:p>
-            <w:r>
-              <w:rPr>
-                <w:b/>
-                <w:color w:val="FFFFFF"/>
-                <w:sz w:val="18"/>
-              </w:rPr>
-              <w:t>Margin</w:t>
-            </w:r>
-          </w:p>
-        </w:tc>
-        <w:tc>
-          <w:tcPr>
-            <w:tcW w:type="dxa" w:w="1987"/>
-            <w:shd w:fill="34495E"/>
-          </w:tcPr>
-          <w:p>
-            <w:r>
-              <w:rPr>
-                <w:b/>
-                <w:color w:val="FFFFFF"/>
-                <w:sz w:val="18"/>
-              </w:rPr>
-              <w:t>Items Sold</w:t>
-            </w:r>
-          </w:p>
-        </w:tc>
-        <w:tc>
-          <w:tcPr>
-            <w:tcW w:type="dxa" w:w="1987"/>
-            <w:shd w:fill="34495E"/>
-          </w:tcPr>
-          <w:p>
-            <w:r>
-              <w:rPr>
-                <w:b/>
-                <w:color w:val="FFFFFF"/>
-                <w:sz w:val="18"/>
-              </w:rPr>
-              <w:t>Rank</w:t>
-            </w:r>
-          </w:p>
-        </w:tc>
-      </w:tr>
-      <w:tr>
-        <w:tc>
-          <w:tcPr>
-            <w:tcW w:type="dxa" w:w="1987"/>
-          </w:tcPr>
-          <w:p>
-            <w:r>
-              <w:rPr>
-                <w:b/>
-                <w:sz w:val="18"/>
-              </w:rPr>
-              <w:t>KES -2,720</w:t>
-            </w:r>
-          </w:p>
-        </w:tc>
-        <w:tc>
-          <w:tcPr>
-            <w:tcW w:type="dxa" w:w="1987"/>
-          </w:tcPr>
-          <w:p>
-            <w:r>
-              <w:rPr>
-                <w:b/>
-                <w:sz w:val="18"/>
-              </w:rPr>
-              <w:t>KES -540</w:t>
-            </w:r>
-          </w:p>
-        </w:tc>
-        <w:tc>
-          <w:tcPr>
-            <w:tcW w:type="dxa" w:w="1987"/>
-          </w:tcPr>
-          <w:p>
-            <w:r>
-              <w:rPr>
-                <w:b/>
-                <w:sz w:val="18"/>
-              </w:rPr>
-              <w:t>0.0%</w:t>
-            </w:r>
-          </w:p>
-        </w:tc>
-        <w:tc>
-          <w:tcPr>
-            <w:tcW w:type="dxa" w:w="1987"/>
-          </w:tcPr>
-          <w:p>
-            <w:r>
-              <w:rPr>
-                <w:b/>
-                <w:sz w:val="18"/>
-              </w:rPr>
-              <w:t>-5</w:t>
-            </w:r>
-          </w:p>
-        </w:tc>
-        <w:tc>
-          <w:tcPr>
-            <w:tcW w:type="dxa" w:w="1987"/>
-          </w:tcPr>
-          <w:p>
-            <w:r>
-              <w:rPr>
-                <w:b/>
-                <w:sz w:val="18"/>
-              </w:rPr>
-              <w:t>#10</w:t>
-            </w:r>
-          </w:p>
-        </w:tc>
-      </w:tr>
-    </w:tbl>
-    <w:p/>
-    <w:tbl>
-      <w:tblPr>
-        <w:tblStyle w:val="TableGrid"/>
-        <w:tblW w:type="auto" w:w="0"/>
-        <w:tblLook w:firstColumn="1" w:firstRow="1" w:lastColumn="0" w:lastRow="0" w:noHBand="0" w:noVBand="1" w:val="04A0"/>
-      </w:tblPr>
-      <w:tblGrid>
-        <w:gridCol w:w="1987"/>
-        <w:gridCol w:w="1987"/>
-        <w:gridCol w:w="1987"/>
-        <w:gridCol w:w="1987"/>
-        <w:gridCol w:w="1987"/>
-      </w:tblGrid>
-      <w:tr>
-        <w:tc>
-          <w:tcPr>
-            <w:tcW w:type="dxa" w:w="1987"/>
-            <w:shd w:fill="3498DB"/>
-          </w:tcPr>
-          <w:p>
-            <w:r>
-              <w:rPr>
-                <w:b/>
-                <w:color w:val="FFFFFF"/>
-                <w:sz w:val="18"/>
-              </w:rPr>
-              <w:t>Category</w:t>
-            </w:r>
-          </w:p>
-        </w:tc>
-        <w:tc>
-          <w:tcPr>
-            <w:tcW w:type="dxa" w:w="1987"/>
-            <w:shd w:fill="3498DB"/>
-          </w:tcPr>
-          <w:p>
-            <w:r>
-              <w:rPr>
-                <w:b/>
-                <w:color w:val="FFFFFF"/>
-                <w:sz w:val="18"/>
-              </w:rPr>
-              <w:t>Sales</w:t>
-            </w:r>
-          </w:p>
-        </w:tc>
-        <w:tc>
-          <w:tcPr>
-            <w:tcW w:type="dxa" w:w="1987"/>
-            <w:shd w:fill="3498DB"/>
-          </w:tcPr>
-          <w:p>
-            <w:r>
-              <w:rPr>
-                <w:b/>
-                <w:color w:val="FFFFFF"/>
-                <w:sz w:val="18"/>
-              </w:rPr>
-              <w:t>Profit</w:t>
-            </w:r>
-          </w:p>
-        </w:tc>
-        <w:tc>
-          <w:tcPr>
-            <w:tcW w:type="dxa" w:w="1987"/>
-            <w:shd w:fill="3498DB"/>
-          </w:tcPr>
-          <w:p>
-            <w:r>
-              <w:rPr>
-                <w:b/>
-                <w:color w:val="FFFFFF"/>
-                <w:sz w:val="18"/>
-              </w:rPr>
-              <w:t>Margin</w:t>
-            </w:r>
-          </w:p>
-        </w:tc>
-        <w:tc>
-          <w:tcPr>
-            <w:tcW w:type="dxa" w:w="1987"/>
-            <w:shd w:fill="3498DB"/>
-          </w:tcPr>
-          <w:p>
-            <w:r>
-              <w:rPr>
-                <w:b/>
-                <w:color w:val="FFFFFF"/>
-                <w:sz w:val="18"/>
-              </w:rPr>
-              <w:t>Qty</w:t>
-            </w:r>
-          </w:p>
-        </w:tc>
-      </w:tr>
-      <w:tr>
-        <w:tc>
-          <w:tcPr>
-            <w:tcW w:type="dxa" w:w="1987"/>
-          </w:tcPr>
-          <w:p>
-            <w:r>
-              <w:rPr>
-                <w:sz w:val="18"/>
-              </w:rPr>
-              <w:t>GENERAL HARDWARE</w:t>
-            </w:r>
-          </w:p>
-        </w:tc>
-        <w:tc>
-          <w:tcPr>
-            <w:tcW w:type="dxa" w:w="1987"/>
-          </w:tcPr>
-          <w:p>
-            <w:r>
-              <w:rPr>
-                <w:sz w:val="18"/>
-              </w:rPr>
-              <w:t>KES -820</w:t>
-            </w:r>
-          </w:p>
-        </w:tc>
-        <w:tc>
-          <w:tcPr>
-            <w:tcW w:type="dxa" w:w="1987"/>
-          </w:tcPr>
-          <w:p>
-            <w:r>
-              <w:rPr>
-                <w:sz w:val="18"/>
-              </w:rPr>
-              <w:t>KES -244</w:t>
-            </w:r>
-          </w:p>
-        </w:tc>
-        <w:tc>
-          <w:tcPr>
-            <w:tcW w:type="dxa" w:w="1987"/>
-          </w:tcPr>
-          <w:p>
-            <w:r>
-              <w:rPr>
-                <w:sz w:val="18"/>
-              </w:rPr>
-              <w:t>0.0%</w:t>
-            </w:r>
-          </w:p>
-        </w:tc>
-        <w:tc>
-          <w:tcPr>
-            <w:tcW w:type="dxa" w:w="1987"/>
-          </w:tcPr>
-          <w:p>
-            <w:r>
-              <w:rPr>
-                <w:sz w:val="18"/>
-              </w:rPr>
-              <w:t>-4</w:t>
-            </w:r>
-          </w:p>
-        </w:tc>
-      </w:tr>
-      <w:tr>
-        <w:tc>
-          <w:tcPr>
-            <w:tcW w:type="dxa" w:w="1987"/>
-          </w:tcPr>
-          <w:p>
-            <w:r>
-              <w:rPr>
-                <w:sz w:val="18"/>
-              </w:rPr>
-              <w:t>PAINTS</w:t>
-            </w:r>
-          </w:p>
-        </w:tc>
-        <w:tc>
-          <w:tcPr>
-            <w:tcW w:type="dxa" w:w="1987"/>
-          </w:tcPr>
-          <w:p>
-            <w:r>
-              <w:rPr>
-                <w:sz w:val="18"/>
-              </w:rPr>
-              <w:t>KES -1,900</w:t>
-            </w:r>
-          </w:p>
-        </w:tc>
-        <w:tc>
-          <w:tcPr>
-            <w:tcW w:type="dxa" w:w="1987"/>
-          </w:tcPr>
-          <w:p>
-            <w:r>
-              <w:rPr>
-                <w:sz w:val="18"/>
-              </w:rPr>
-              <w:t>KES -296</w:t>
-            </w:r>
-          </w:p>
-        </w:tc>
-        <w:tc>
-          <w:tcPr>
-            <w:tcW w:type="dxa" w:w="1987"/>
-          </w:tcPr>
-          <w:p>
-            <w:r>
-              <w:rPr>
-                <w:sz w:val="18"/>
-              </w:rPr>
-              <w:t>0.0%</w:t>
-            </w:r>
-          </w:p>
-        </w:tc>
-        <w:tc>
-          <w:tcPr>
-            <w:tcW w:type="dxa" w:w="1987"/>
-          </w:tcPr>
-          <w:p>
-            <w:r>
-              <w:rPr>
-                <w:sz w:val="18"/>
-              </w:rPr>
-              <w:t>-1</w:t>
-            </w:r>
-          </w:p>
-        </w:tc>
-      </w:tr>
-    </w:tbl>
     <w:p>
       <w:r>
         <w:rPr>
           <w:b/>
-          <w:color w:val="8E44AD"/>
-          <w:sz w:val="20"/>
         </w:rPr>
-        <w:t>Performance Notes:</w:t>
+        <w:t>1. Overall Quarterly Performance</w:t>
       </w:r>
     </w:p>
     <w:p>
-      <w:pPr>
-        <w:pStyle w:val="ListBullet"/>
-      </w:pPr>
       <w:r>
-        <w:rPr>
-          <w:color w:val="E74C3C"/>
-          <w:sz w:val="18"/>
-        </w:rPr>
-        <w:t>Sales 100% below team average - needs improvement</w:t>
+        <w:t>BOMAS Hardware Store generated KES 183,447,102 in revenue and KES 16,495,840 in gross profit during the first 74 working days of Q1 2026. This translates to an average daily revenue of KES 2,479,015 and an average daily profit of KES 222,917. The overall profit margin stabilized at 9.0%.</w:t>
       </w:r>
     </w:p>
     <w:p>
-      <w:pPr>
-        <w:pStyle w:val="ListBullet"/>
-      </w:pPr>
       <w:r>
         <w:rPr>
-          <w:color w:val="E74C3C"/>
-          <w:sz w:val="18"/>
+          <w:b/>
         </w:rPr>
-        <w:t>Margin at 0.0% below team average of 11.3%</w:t>
+        <w:t>2. Departmental Contribution &amp; Margin Analysis</w:t>
       </w:r>
     </w:p>
     <w:p>
-      <w:pPr>
-        <w:pStyle w:val="ListBullet"/>
-      </w:pPr>
       <w:r>
-        <w:rPr>
-          <w:color w:val="555555"/>
-          <w:sz w:val="18"/>
-        </w:rPr>
-        <w:t>General Hardware: -0.0% of dept, 0.0% margin</w:t>
+        <w:t>The GENERAL HARDWARE department remains the dominant revenue driver, accounting for 87.2% of total Q1 sales (KES 159,937,385). However, margin analysis reveals that PLUMBING operates at the highest profitability rate (25.2%). Strategic focus should be placed on pushing higher-margin PLUMBING items in Q2 to lift the overall 9.0% store margin.</w:t>
       </w:r>
     </w:p>
     <w:p>
-      <w:pPr>
-        <w:pStyle w:val="ListBullet"/>
-      </w:pPr>
       <w:r>
         <w:rPr>
-          <w:color w:val="E74C3C"/>
-          <w:sz w:val="18"/>
+          <w:b/>
         </w:rPr>
-        <w:t>Limited to 2 categories - expand into PLUMBING, ELECTRICALS</w:t>
+        <w:t>3. Sales Team Productivity</w:t>
       </w:r>
     </w:p>
     <w:p>
-      <w:pPr>
-        <w:pStyle w:val="ListBullet"/>
-      </w:pPr>
+      <w:r>
+        <w:t>Sales concentration is notably high among the top performers. Gladys led the quarter with KES 74,132,410 in sales, followed closely by Betha Odumo (KES 38,903,951). Combined, these top two representatives accounted for 61.6% of the store's total Q1 volume. To mitigate key-person dependency risks, training and mentorship programs should be implemented for the remaining 7 active representatives.</w:t>
+      </w:r>
+    </w:p>
+    <w:p>
       <w:r>
         <w:rPr>
-          <w:color w:val="555555"/>
-          <w:sz w:val="18"/>
+          <w:b/>
         </w:rPr>
-        <w:t>Best margin in GENERAL HARDWARE: 0.0%</w:t>
+        <w:t>4. Q2 Operational Recommendations</w:t>
       </w:r>
     </w:p>
-    <w:p/>
+    <w:p>
+      <w:r>
+        <w:t>- Balance cross-selling between volume leader (General Hardware) and margin leaders (Plumbing/Electricals).</w:t>
+      </w:r>
+    </w:p>
+    <w:p>
+      <w:r>
+        <w:t>- Conduct sales training focused on improving the conversion rates and average order values of bottom-quartile representatives.</w:t>
+      </w:r>
+    </w:p>
+    <w:p>
+      <w:r>
+        <w:t>- Align Minimum Order Quantities (MOQs) with Q1 daily consumption averages to ensure optimal working capital allocation.</w:t>
+      </w:r>
+    </w:p>
     <w:sectPr>
       <w:pgSz w:w="12240" w:h="15840"/>
       <w:pgMar w:top="1008" w:right="1152" w:bottom="1008" w:left="1152" w:header="720" w:footer="720" w:gutter="0"/>

</xml_diff>